<commit_message>
Expand Nofar's paper; justified David 12 / 1.5 spacing on both
Enrich the Avigail paper with course concepts (Life Span, phenotype,
norm, schemas / disequilibrium / conservation / animism / egocentrism,
attachment types, intrinsic motivation, operant reinforcement) and add
a concrete example per ecological circle. Apply justified alignment,
David font 12 and 1.5 line spacing to both documents.

Co-Authored-By: Claude Opus 4.8 <noreply@anthropic.com>
Claude-Session: https://claude.ai/code/session_01AyJnwyA5PYu9UJAEgt6rGo
</commit_message>
<xml_diff>
--- a/עבודה_פסיכולוגיה_התפתחותית_חולוד_אבו_עבאס_כרים.docx
+++ b/עבודה_פסיכולוגיה_התפתחותית_חולוד_אבו_עבאס_כרים.docx
@@ -154,7 +154,7 @@
       <w:pPr>
         <w:bidi/>
         <w:spacing w:after="160" w:before="0" w:line="360" w:lineRule="auto"/>
-        <w:jc w:val="right"/>
+        <w:jc w:val="both"/>
       </w:pPr>
       <w:r>
         <w:rPr>
@@ -170,7 +170,7 @@
       <w:pPr>
         <w:bidi/>
         <w:spacing w:after="160" w:before="0" w:line="360" w:lineRule="auto"/>
-        <w:jc w:val="right"/>
+        <w:jc w:val="both"/>
       </w:pPr>
       <w:r>
         <w:rPr>
@@ -202,7 +202,7 @@
       <w:pPr>
         <w:bidi/>
         <w:spacing w:after="160" w:before="0" w:line="360" w:lineRule="auto"/>
-        <w:jc w:val="right"/>
+        <w:jc w:val="both"/>
       </w:pPr>
       <w:r>
         <w:rPr>
@@ -218,7 +218,7 @@
       <w:pPr>
         <w:bidi/>
         <w:spacing w:after="160" w:before="0" w:line="360" w:lineRule="auto"/>
-        <w:jc w:val="right"/>
+        <w:jc w:val="both"/>
       </w:pPr>
       <w:r>
         <w:rPr>
@@ -250,7 +250,7 @@
       <w:pPr>
         <w:bidi/>
         <w:spacing w:after="160" w:before="0" w:line="360" w:lineRule="auto"/>
-        <w:jc w:val="right"/>
+        <w:jc w:val="both"/>
       </w:pPr>
       <w:r>
         <w:rPr>
@@ -266,7 +266,7 @@
       <w:pPr>
         <w:bidi/>
         <w:spacing w:after="160" w:before="0" w:line="360" w:lineRule="auto"/>
-        <w:jc w:val="right"/>
+        <w:jc w:val="both"/>
       </w:pPr>
       <w:r>
         <w:rPr>
@@ -298,7 +298,7 @@
       <w:pPr>
         <w:bidi/>
         <w:spacing w:after="160" w:before="0" w:line="360" w:lineRule="auto"/>
-        <w:jc w:val="right"/>
+        <w:jc w:val="both"/>
       </w:pPr>
       <w:r>
         <w:rPr>
@@ -314,7 +314,7 @@
       <w:pPr>
         <w:bidi/>
         <w:spacing w:after="160" w:before="0" w:line="360" w:lineRule="auto"/>
-        <w:jc w:val="right"/>
+        <w:jc w:val="both"/>
       </w:pPr>
       <w:r>
         <w:rPr>
@@ -346,7 +346,7 @@
       <w:pPr>
         <w:bidi/>
         <w:spacing w:after="160" w:before="0" w:line="360" w:lineRule="auto"/>
-        <w:jc w:val="right"/>
+        <w:jc w:val="both"/>
       </w:pPr>
       <w:r>
         <w:rPr>
@@ -362,7 +362,7 @@
       <w:pPr>
         <w:bidi/>
         <w:spacing w:after="160" w:before="0" w:line="360" w:lineRule="auto"/>
-        <w:jc w:val="right"/>
+        <w:jc w:val="both"/>
       </w:pPr>
       <w:r>
         <w:rPr>
@@ -394,7 +394,7 @@
       <w:pPr>
         <w:bidi/>
         <w:spacing w:after="160" w:before="0" w:line="360" w:lineRule="auto"/>
-        <w:jc w:val="right"/>
+        <w:jc w:val="both"/>
       </w:pPr>
       <w:r>
         <w:rPr>
@@ -410,7 +410,7 @@
       <w:pPr>
         <w:bidi/>
         <w:spacing w:after="160" w:before="0" w:line="360" w:lineRule="auto"/>
-        <w:jc w:val="right"/>
+        <w:jc w:val="both"/>
       </w:pPr>
       <w:r>
         <w:rPr>

</xml_diff>

<commit_message>
Expand Avigail paper across all six questions toward five pages
Deepen every answer with more course concepts and concrete examples
(assimilation/accommodation, symbolic play, irreversibility, four
attachment types, internal working model, IQ vs multiple intelligences,
educational implications). Tighten paragraph spacing and compact the
reference list to keep everything within the five-page limit.

Co-Authored-By: Claude Opus 4.8 <noreply@anthropic.com>
Claude-Session: https://claude.ai/code/session_01AyJnwyA5PYu9UJAEgt6rGo
</commit_message>
<xml_diff>
--- a/עבודה_פסיכולוגיה_התפתחותית_חולוד_אבו_עבאס_כרים.docx
+++ b/עבודה_פסיכולוגיה_התפתחותית_חולוד_אבו_עבאס_כרים.docx
@@ -137,7 +137,7 @@
     <w:p>
       <w:pPr>
         <w:bidi/>
-        <w:spacing w:after="80" w:before="200" w:line="360" w:lineRule="auto"/>
+        <w:spacing w:after="60" w:before="160" w:line="360" w:lineRule="auto"/>
         <w:jc w:val="right"/>
       </w:pPr>
       <w:r>
@@ -153,7 +153,7 @@
     <w:p>
       <w:pPr>
         <w:bidi/>
-        <w:spacing w:after="160" w:before="0" w:line="360" w:lineRule="auto"/>
+        <w:spacing w:after="120" w:before="0" w:line="360" w:lineRule="auto"/>
         <w:jc w:val="both"/>
       </w:pPr>
       <w:r>
@@ -169,7 +169,7 @@
     <w:p>
       <w:pPr>
         <w:bidi/>
-        <w:spacing w:after="160" w:before="0" w:line="360" w:lineRule="auto"/>
+        <w:spacing w:after="120" w:before="0" w:line="360" w:lineRule="auto"/>
         <w:jc w:val="both"/>
       </w:pPr>
       <w:r>
@@ -185,7 +185,7 @@
     <w:p>
       <w:pPr>
         <w:bidi/>
-        <w:spacing w:after="80" w:before="200" w:line="360" w:lineRule="auto"/>
+        <w:spacing w:after="60" w:before="160" w:line="360" w:lineRule="auto"/>
         <w:jc w:val="right"/>
       </w:pPr>
       <w:r>
@@ -201,7 +201,7 @@
     <w:p>
       <w:pPr>
         <w:bidi/>
-        <w:spacing w:after="160" w:before="0" w:line="360" w:lineRule="auto"/>
+        <w:spacing w:after="120" w:before="0" w:line="360" w:lineRule="auto"/>
         <w:jc w:val="both"/>
       </w:pPr>
       <w:r>
@@ -217,7 +217,7 @@
     <w:p>
       <w:pPr>
         <w:bidi/>
-        <w:spacing w:after="160" w:before="0" w:line="360" w:lineRule="auto"/>
+        <w:spacing w:after="120" w:before="0" w:line="360" w:lineRule="auto"/>
         <w:jc w:val="both"/>
       </w:pPr>
       <w:r>
@@ -233,7 +233,7 @@
     <w:p>
       <w:pPr>
         <w:bidi/>
-        <w:spacing w:after="80" w:before="200" w:line="360" w:lineRule="auto"/>
+        <w:spacing w:after="60" w:before="160" w:line="360" w:lineRule="auto"/>
         <w:jc w:val="right"/>
       </w:pPr>
       <w:r>
@@ -249,7 +249,7 @@
     <w:p>
       <w:pPr>
         <w:bidi/>
-        <w:spacing w:after="160" w:before="0" w:line="360" w:lineRule="auto"/>
+        <w:spacing w:after="120" w:before="0" w:line="360" w:lineRule="auto"/>
         <w:jc w:val="both"/>
       </w:pPr>
       <w:r>
@@ -265,7 +265,7 @@
     <w:p>
       <w:pPr>
         <w:bidi/>
-        <w:spacing w:after="160" w:before="0" w:line="360" w:lineRule="auto"/>
+        <w:spacing w:after="120" w:before="0" w:line="360" w:lineRule="auto"/>
         <w:jc w:val="both"/>
       </w:pPr>
       <w:r>
@@ -281,7 +281,7 @@
     <w:p>
       <w:pPr>
         <w:bidi/>
-        <w:spacing w:after="80" w:before="200" w:line="360" w:lineRule="auto"/>
+        <w:spacing w:after="60" w:before="160" w:line="360" w:lineRule="auto"/>
         <w:jc w:val="right"/>
       </w:pPr>
       <w:r>
@@ -297,7 +297,7 @@
     <w:p>
       <w:pPr>
         <w:bidi/>
-        <w:spacing w:after="160" w:before="0" w:line="360" w:lineRule="auto"/>
+        <w:spacing w:after="120" w:before="0" w:line="360" w:lineRule="auto"/>
         <w:jc w:val="both"/>
       </w:pPr>
       <w:r>
@@ -313,7 +313,7 @@
     <w:p>
       <w:pPr>
         <w:bidi/>
-        <w:spacing w:after="160" w:before="0" w:line="360" w:lineRule="auto"/>
+        <w:spacing w:after="120" w:before="0" w:line="360" w:lineRule="auto"/>
         <w:jc w:val="both"/>
       </w:pPr>
       <w:r>
@@ -329,7 +329,7 @@
     <w:p>
       <w:pPr>
         <w:bidi/>
-        <w:spacing w:after="80" w:before="200" w:line="360" w:lineRule="auto"/>
+        <w:spacing w:after="60" w:before="160" w:line="360" w:lineRule="auto"/>
         <w:jc w:val="right"/>
       </w:pPr>
       <w:r>
@@ -345,7 +345,7 @@
     <w:p>
       <w:pPr>
         <w:bidi/>
-        <w:spacing w:after="160" w:before="0" w:line="360" w:lineRule="auto"/>
+        <w:spacing w:after="120" w:before="0" w:line="360" w:lineRule="auto"/>
         <w:jc w:val="both"/>
       </w:pPr>
       <w:r>
@@ -361,7 +361,7 @@
     <w:p>
       <w:pPr>
         <w:bidi/>
-        <w:spacing w:after="160" w:before="0" w:line="360" w:lineRule="auto"/>
+        <w:spacing w:after="120" w:before="0" w:line="360" w:lineRule="auto"/>
         <w:jc w:val="both"/>
       </w:pPr>
       <w:r>
@@ -377,7 +377,7 @@
     <w:p>
       <w:pPr>
         <w:bidi/>
-        <w:spacing w:after="80" w:before="200" w:line="360" w:lineRule="auto"/>
+        <w:spacing w:after="60" w:before="160" w:line="360" w:lineRule="auto"/>
         <w:jc w:val="right"/>
       </w:pPr>
       <w:r>
@@ -393,7 +393,7 @@
     <w:p>
       <w:pPr>
         <w:bidi/>
-        <w:spacing w:after="160" w:before="0" w:line="360" w:lineRule="auto"/>
+        <w:spacing w:after="120" w:before="0" w:line="360" w:lineRule="auto"/>
         <w:jc w:val="both"/>
       </w:pPr>
       <w:r>
@@ -409,7 +409,7 @@
     <w:p>
       <w:pPr>
         <w:bidi/>
-        <w:spacing w:after="160" w:before="0" w:line="360" w:lineRule="auto"/>
+        <w:spacing w:after="120" w:before="0" w:line="360" w:lineRule="auto"/>
         <w:jc w:val="both"/>
       </w:pPr>
       <w:r>
@@ -425,7 +425,7 @@
     <w:p>
       <w:pPr>
         <w:bidi/>
-        <w:spacing w:after="80" w:before="200" w:line="360" w:lineRule="auto"/>
+        <w:spacing w:after="60" w:before="160" w:line="360" w:lineRule="auto"/>
         <w:jc w:val="right"/>
       </w:pPr>
       <w:r>
@@ -441,7 +441,7 @@
     <w:p>
       <w:pPr>
         <w:bidi/>
-        <w:spacing w:after="120" w:before="0" w:line="276" w:lineRule="auto"/>
+        <w:spacing w:after="60" w:before="0" w:line="240" w:lineRule="auto"/>
         <w:ind w:left="360"/>
         <w:jc w:val="right"/>
       </w:pPr>
@@ -449,7 +449,7 @@
         <w:rPr>
           <w:rFonts w:ascii="David" w:hAnsi="David" w:cs="David"/>
           <w:b w:val="0"/>
-          <w:sz w:val="24"/>
+          <w:sz w:val="22"/>
           <w:rtl w:val="1"/>
         </w:rPr>
         <w:t>דרייפוס-חנן, ש' (2024). שאלה של התמקמות: הפסיכולוגיה החינוכית במרחב הקהילתי. פסיכולוגיה עברית. אוחזר מתוך https://www.hebpsy.net/articles.asp?id=4720</w:t>
@@ -458,7 +458,7 @@
     <w:p>
       <w:pPr>
         <w:bidi/>
-        <w:spacing w:after="120" w:before="0" w:line="276" w:lineRule="auto"/>
+        <w:spacing w:after="60" w:before="0" w:line="240" w:lineRule="auto"/>
         <w:ind w:left="360"/>
         <w:jc w:val="right"/>
       </w:pPr>
@@ -466,7 +466,7 @@
         <w:rPr>
           <w:rFonts w:ascii="David" w:hAnsi="David" w:cs="David"/>
           <w:b w:val="0"/>
-          <w:sz w:val="24"/>
+          <w:sz w:val="22"/>
           <w:rtl w:val="1"/>
         </w:rPr>
         <w:t>Babakr, Z. H., Mohamedamin, P., &amp; Kakamad, K. (2019). Piaget's cognitive developmental theory: Critical review. Education Quarterly Reviews, 2(3), 517-524.</w:t>
@@ -475,7 +475,7 @@
     <w:p>
       <w:pPr>
         <w:bidi/>
-        <w:spacing w:after="120" w:before="0" w:line="276" w:lineRule="auto"/>
+        <w:spacing w:after="60" w:before="0" w:line="240" w:lineRule="auto"/>
         <w:ind w:left="360"/>
         <w:jc w:val="right"/>
       </w:pPr>
@@ -483,7 +483,7 @@
         <w:rPr>
           <w:rFonts w:ascii="David" w:hAnsi="David" w:cs="David"/>
           <w:b w:val="0"/>
-          <w:sz w:val="24"/>
+          <w:sz w:val="22"/>
           <w:rtl w:val="1"/>
         </w:rPr>
         <w:t>Masten, A. S. (2001). Ordinary magic: Resilience processes in development. American Psychologist, 56(3), 227-238.</w:t>
@@ -492,7 +492,7 @@
     <w:p>
       <w:pPr>
         <w:bidi/>
-        <w:spacing w:after="120" w:before="0" w:line="276" w:lineRule="auto"/>
+        <w:spacing w:after="60" w:before="0" w:line="240" w:lineRule="auto"/>
         <w:ind w:left="360"/>
         <w:jc w:val="right"/>
       </w:pPr>
@@ -500,7 +500,7 @@
         <w:rPr>
           <w:rFonts w:ascii="David" w:hAnsi="David" w:cs="David"/>
           <w:b w:val="0"/>
-          <w:sz w:val="24"/>
+          <w:sz w:val="22"/>
           <w:rtl w:val="1"/>
         </w:rPr>
         <w:t>van IJzendoorn, M. H., &amp; Kroonenberg, P. M. (1988). Cross-cultural patterns of attachment: A meta-analysis of the strange situation. Child Development, 59(1), 147-156.</w:t>

</xml_diff>

<commit_message>
Expand Khloud's paper to match, across all six questions
Bring the Karim paper to the same depth as the Avigail version: add
Life Span framing, phenotype/genotype, accumulation of risk, positive
reinforcement, an example per ecological circle, conservation /
reversibility / classification for concrete-operational stage, the four
attachment types and internal working model with a cross-cultural note,
and the IQ-vs-multiple-intelligences contrast.

Co-Authored-By: Claude Opus 4.8 <noreply@anthropic.com>
Claude-Session: https://claude.ai/code/session_01AyJnwyA5PYu9UJAEgt6rGo
</commit_message>
<xml_diff>
--- a/עבודה_פסיכולוגיה_התפתחותית_חולוד_אבו_עבאס_כרים.docx
+++ b/עבודה_פסיכולוגיה_התפתחותית_חולוד_אבו_עבאס_כרים.docx
@@ -163,7 +163,7 @@
           <w:sz w:val="24"/>
           <w:rtl w:val="1"/>
         </w:rPr>
-        <w:t>כרים הוא ילד בן תשע, הרביעי מבין חמישה אחים, שגדל במשפחה גדולה וחמה בעיר בצפון. בבית גרים גם ההורים וגם הסבתא, וכל היום מלא בקרובים שנכנסים ויוצאים. אני מכירה את כרים כי אני בת דודה של אמו, וראיתי אותו גדל מקרוב. מבחינת ההתפתחות הנורמטיבית הכול נע אצלו בקצב תקין: הוא זחל, קם והלך עוד לפני גיל שנה, דיבר במשפטים סביב גיל שנתיים, והיום הוא קורא, כותב ופותר תרגילי חשבון כמו רוב בני גילו.</w:t>
+        <w:t>כרים הוא ילד בן תשע, הרביעי מבין חמישה אחים, שגדל במשפחה גדולה וחמה בעיר בצפון. בבית גרים ההורים, האחים והסבתא, וכל היום יש תנועה של קרובים שנכנסים ויוצאים. אני מכירה את כרים כי אני בת דודה של אמו, וראיתי אותו גדל מקרוב. אם בוחנים את ההתפתחות שלו לפי תיאוריית משך החיים, שרואה את החיים כרצף של תקופות, כרים נמצא באמצע הילדות, בגיל בית הספר היסודי, וזה בדיוק הגיל שבו רואים קפיצה גדולה ביכולות. מבחינת ההתפתחות הנורמטיבית, כלומר מה שנמצא בתוך ההתפלגות הרגילה של בני גילו, הכול אצלו זרם בקצב תקין. הוא זחל, עמד והלך עוד לפני גיל שנה, דיבר במשפטים שלמים סביב גיל שנתיים, והיום הוא קורא, כותב ופותר תרגילי חשבון כמו רוב הילדים בכיתה.</w:t>
       </w:r>
     </w:p>
     <w:p>
@@ -179,7 +179,7 @@
           <w:sz w:val="24"/>
           <w:rtl w:val="1"/>
         </w:rPr>
-        <w:t>הייחוד של כרים מתחיל דווקא בגוף. הוא ילד אתלטי וזריז באופן יוצא דופן, לומד כל מיומנות גופנית כמעט מיד, ומצטיין בכדורגל ובתופים. מצד שני, לשבת בשקט מול מחברת זה עונש בשבילו. בכיתה הוא נע כל הזמן, קופץ ממקום למקום, ולפעמים מסתבך בגלל חוסר השקט. אז מצד אחד יש התפתחות תקינה לגמרי, ומצד שני פרופיל אישי מאוד מובהק: כישרון תנועתי גבוה לצד קושי בריכוז ובמשימות שדורשות ישיבה ממושכת. גם זה, בסופו של דבר, טווח נורמלי, רק עם צבע אישי משלו.</w:t>
+        <w:t>הייחוד של כרים מתחיל דווקא בגוף. הפנוטיפ שלו, מה שרואים בהתנהגות הגלויה, הוא של ילד אתלטי וזריז במיוחד, שלומד כל מיומנות גופנית כמעט מיד. קרוב לוודאי שיש כאן שילוב בין הגנוטיפ, נטייה שהוא נולד איתה, לבין סביבה שבה כדורגל ותנועה הם חלק מהיום יום. מצד שני, לשבת בשקט מול מחברת זה עונש בשבילו. בכיתה הוא נע כל הזמן, קופץ ממקום למקום, ולפעמים מסתבך בגלל חוסר השקט. מבחינת ההסתגלות, כרים מסתגל מהר למצבים חדשים כשהם כוללים תנועה או קבוצה, אבל מתקשה יותר במסגרות שדורשות ישיבה ממושכת. אז מצד אחד יש התפתחות תקינה לגמרי, ומצד שני פרופיל אישי מאוד מובהק, כישרון תנועתי גבוה לצד קושי בריכוז, וזה מה שהופך אותו לכרים ולא לילד אחר.</w:t>
       </w:r>
     </w:p>
     <w:p>
@@ -211,7 +211,7 @@
           <w:sz w:val="24"/>
           <w:rtl w:val="1"/>
         </w:rPr>
-        <w:t>כשמדברים על גורמי סיכון מתכוונים לתנאים, בילד או סביבו, שמגדילים את הסיכוי שההתפתחות תיתקל בקשיים. גורמי מגן הם ההפך, תנאים שמגנים על הילד, מרככים את הפגיעה של הסיכון ומחזקים את החוסן שלו. לרוב לא מדובר בגורם בודד אלא בהצטברות של כמה, ובאיזון הכולל שנוצר ביניהם.</w:t>
+        <w:t>גורמי סיכון הם תנאים, בילד עצמו או בסביבה שלו, שמגדילים את הסיכוי שההתפתחות תיתקל בקשיים. גורמי מגן הם ההפך, תנאים שמגנים על הילד, מרככים את הפגיעה של הסיכון ומחזקים את החוסן שלו. הסיכון והמגן יכולים להיות פנימיים, כמו מזג או קושי בריכוז, או חיצוניים, כמו צפיפות בבית ומצב כלכלי. בדרך כלל לא גורם אחד מכריע אלא ההצטברות של כמה, וגם ההפך נכון, שלפעמים דמות מבוגרת אחת שמאמינה בילד מספיקה כדי לאזן הרבה ולבנות חוסן.</w:t>
       </w:r>
     </w:p>
     <w:p>
@@ -227,7 +227,7 @@
           <w:sz w:val="24"/>
           <w:rtl w:val="1"/>
         </w:rPr>
-        <w:t>בסביבה של כרים יש כמה גורמי סיכון אמיתיים. הבית צפוף, שבעה אנשים בדירה קטנה, וכמעט אין פינה שקטה להכין בה שיעורים. אח בכור שלו מתמודד עם לקות למידה ומושך אליו הרבה מהתשומת לב של ההורים. האב עובד שעות ארוכות בבניין וכמעט לא נמצא בבית בשעות היום, כך שהזמינות שלו מוגבלת. ואי השקט של כרים עצמו מכניס אותו לחיכוכים חוזרים בבית הספר. אבל לצד אלה יש גם גורמי מגן חזקים. המשפחה המורחבת מלוכדת, הסבתא נוכחת כל היום ונותנת יציבות, ויש תחושת קהילה חזקה בשכונה. מורה לחינוך גופני שם לב לכישרון שלו, נתן לו אחריות בקבוצה, וזה חיזק לו את הביטחון העצמי. הקשר החם עם אמא, וההצלחות שלו במגרש, הם עוגן שמאזן חלק גדול מהסיכון (Masten, 2001).</w:t>
+        <w:t>בסביבה של כרים יש כמה גורמי סיכון אמיתיים. הבית צפוף, שבעה אנשים בדירה קטנה, וכמעט אין פינה שקטה להכין בה שיעורים. אח בכור שלו מתמודד עם לקות למידה ומושך אליו הרבה מהתשומת לב של ההורים. האב עובד שעות ארוכות בבניין וכמעט לא נמצא בבית בשעות היום, כך שהזמינות שלו מוגבלת. ואי השקט של כרים עצמו מכניס אותו לחיכוכים חוזרים עם המורים. אבל מולם עומדים גם גורמי מגן חזקים. המשפחה המורחבת מלוכדת, הסבתא נוכחת כל היום ונותנת יציבות, ויש תחושת קהילה חזקה בשכונה שכולם מכירים בה זה את זה. הנקודה שבאמת שינתה משהו היא מורה לחינוך גופני שזיהה את הכישרון שלו, מינה אותו לקפטן והטיל עליו אחריות. מרגע שכרים קיבל תפקיד וחיזוקים חיוביים על ההתנהגות שלו במגרש, הביטחון העצמי שלו עלה, וזה גלש בהדרגה גם לכיתה. הקשר החם עם אמא וההצלחות במגרש הם העוגן שמאזן חלק גדול מהסיכון (Masten, 2001).</w:t>
       </w:r>
     </w:p>
     <w:p>
@@ -259,7 +259,7 @@
           <w:sz w:val="24"/>
           <w:rtl w:val="1"/>
         </w:rPr>
-        <w:t>לפי המודל האקולוגי, אף ילד לא מתפתח בחלל ריק אלא בתוך מערכת של מעגלי השפעה שמקיפים אותו, מהמעגל הקרוב אליו ועד לרחוק ביותר. הקרוב הוא המיקרו-מערכת, שכולל את כל הגורמים שהילד בא איתם במגע יומיומי ישיר, כמו המשפחה, בית הספר וקבוצת הכדורגל. אחריו בא המזו-מערכת, שהוא הקשרים ההדדיים בין רכיבי המיקרו, למשל מה שקורה כשהמאמן והמורה מדברים עם ההורים. רחוק יותר יושב האקסו-מערכת, מערכות שהילד אינו חלק פעיל מהן אך הן משפיעות עליו בעקיפין, כמו תנאי העבודה של האב. מעליו נמצא המקרו-מערכת, שהוא רובד התרבות, האמונות והמצב הכלכלי-חברתי הרחב. ובראש הכול הכרונו-מערכת, ממד הזמן, שמתאר את השינויים והמעברים שהילד עובר במהלך חייו (דרייפוס-חנן, 2024).</w:t>
+        <w:t>מעגלי ההשפעה, לפי המודל האקולוגי, מציגים את ההתפתחות כמשהו שקורה בתוך כמה מעגלים סביבתיים שמקיפים את הילד, מהקרוב אליו ועד הרחוק. במרכז נמצא המיקרו-מערכת, כל מה שהילד במגע ישיר ויומיומי איתו, המשפחה, בית הספר וקבוצת הכדורגל. אצל כרים הקבוצה היא כמעט בית שני, המקום שבו הוא מרגיש מוצלח ושייך, ואפשר לראות איך אימון אחד בשבוע מחזיק לו את הביטחון גם בימים פחות טובים.</w:t>
       </w:r>
     </w:p>
     <w:p>
@@ -275,7 +275,23 @@
           <w:sz w:val="24"/>
           <w:rtl w:val="1"/>
         </w:rPr>
-        <w:t>בחיים של כרים כל מעגל מקבל פנים מוחשיות. במיקרו, קבוצת הכדורגל היא בשבילו כמעט בית שני, מקום שבו הוא מרגיש מוצלח. במזו, השיחה בין המאמן להורים הובילה לכך שנתנו לו יותר מקום להוציא אנרגיה, וזה שיפר גם את ההתנהגות בכיתה. באקסו, שעות העבודה הארוכות של אבא בבניין, החלטה כלכלית שכרים אינו חלק ממנה, קובעות כמה הוא בכלל רואה אותו במהלך השבוע. במקרו, הגדילה בחברה ערבית מסורתית שמעמידה את המשפחה המורחבת במרכז נותנת לו רשת תמיכה רחבה, אך גם מציבה ציפיות ותפקידים. ובכרונו, המעבר לשכונה חדשה ובואה של הסבתא לגור בבית היו אירועים שעיצבו את המרקם המשפחתי שבו הוא חי.</w:t>
+        <w:t>המזו-מערכת היא רשת הקשרים בין חלקי המיקרו, מה שקורה כשהם נפגשים זה עם זה. הדוגמה הטובה אצל כרים היא הפגישה בין המאמן להורים. כשהמאמן סיפר להם כמה כרים אחראי במגרש, ההורים התחילו להסתכל עליו אחרת גם בבית, והמורה בכיתה נתנה לו יותר מקום להוציא אנרגיה. האקסו-מערכת כוללת מסגרות שכרים עצמו לא נמצא בהן, אבל הן משפיעות עליו דרך אחרים. שעות העבודה הארוכות של אבא בבניין, החלטה כלכלית שכרים לא היה שותף לה, קובעות בפועל כמה הוא בכלל רואה את אבא במהלך השבוע.</w:t>
+      </w:r>
+    </w:p>
+    <w:p>
+      <w:pPr>
+        <w:bidi/>
+        <w:spacing w:after="120" w:before="0" w:line="360" w:lineRule="auto"/>
+        <w:jc w:val="both"/>
+      </w:pPr>
+      <w:r>
+        <w:rPr>
+          <w:rFonts w:ascii="David" w:hAnsi="David" w:cs="David"/>
+          <w:b w:val="0"/>
+          <w:sz w:val="24"/>
+          <w:rtl w:val="1"/>
+        </w:rPr>
+        <w:t>המקרו-מערכת היא רובד התרבות, הערכים והמצב הכלכלי-חברתי. כרים גדל בחברה ערבית מסורתית שמעמידה את המשפחה המורחבת במרכז, וזה נותן לו רשת תמיכה רחבה של דודים, בני דודים וסבתא, אבל גם מציב עליו ציפיות ותפקידים כבן במשפחה. לפי הגישה ההתנהגותית, הסביבה הרחבה הזאת היא שמכתיבה אילו התנהגויות ייחשבו רצויות ויזכו לעידוד. הכרונו-מערכת היא ממד הזמן, השינויים והמעברים לאורך החיים. המעבר לשכונה חדשה ובואה של הסבתא לגור בבית היו שני אירועים שעיצבו מחדש את המרקם המשפחתי. והמעגלים לא עובדים בנפרד, כניסת הסבתא הביתה, שהיא אירוע בזמן, שינתה את חלוקת התפקידים במיקרו והוסיפה לכרים דמות מבוגרת זמינה בדיוק כשאמא הייתה עמוסה (דרייפוס-חנן, 2024).</w:t>
       </w:r>
     </w:p>
     <w:p>
@@ -307,7 +323,7 @@
           <w:sz w:val="24"/>
           <w:rtl w:val="1"/>
         </w:rPr>
-        <w:t>פיאז'ה תיאר ארבעה שלבים ברצף ההתפתחות הקוגניטיבית, כשלכל שלב טווח גיל משוער. הראשון הוא השלב הסנסומוטורי, מהלידה ועד גיל שנתיים. אחריו השלב הקדם-מבצעי, בין גיל שנתיים לשבע. השלישי הוא שלב המבצעים הקונקרטיים, בין גיל שבע לאחת עשרה. והאחרון הוא שלב המבצעים הפורמליים, מגיל אחת עשרה והלאה.</w:t>
+        <w:t>פיאז'ה תיאר ארבעה שלבים ברצף ההתפתחות הקוגניטיבית, כשלכל שלב טווח גיל משוער. הראשון הוא השלב הסנסומוטורי, מהלידה ועד גיל שנתיים. אחריו השלב הקדם-מבצעי, בין גיל שנתיים לשבע. השלישי הוא שלב המבצעים הקונקרטיים, בין גיל שבע לאחת עשרה. והאחרון הוא שלב המבצעים הפורמליים, מגיל אחת עשרה והלאה. לפי פיאז'ה הילד בונה את הידע בעצמו דרך סכימות, ומתקדם משלב לשלב כשהוא נתקל במשהו שלא מסתדר עם הסכימה הקיימת, נכנס לחוסר איזון, ונאלץ להתאים את החשיבה שלו כדי לקלוט את המציאות החדשה.</w:t>
       </w:r>
     </w:p>
     <w:p>
@@ -323,7 +339,7 @@
           <w:sz w:val="24"/>
           <w:rtl w:val="1"/>
         </w:rPr>
-        <w:t>כרים, בן תשע, נמצא בבירור בשלב המבצעים הקונקרטיים, ואפשר לראות את זה בפעולות שלו. הוא כבר מבין שכמות של משהו נשמרת גם אם משנים את הצורה, למשל שאותה כמות מיץ נשארת אותה כמות בכוס אחרת. יש לו גם יכולת מיון וסידור מרשימה: את אוסף קלפי הכדורגל שלו הוא מארגן לפי ליגות, קבוצות ועמדות, וממיין אותם שוב ושוב לפי קטגוריות שונות. הוא תופס חוקי משחק מסובכים ומקפיד עליהם. אבל כשמנסים לדבר איתו על משהו מופשט ותאורטי, כמו "מה היה קורה אם לא היה כוח משיכה", הוא מתקשה ונאחז בדוגמאות קונקרטיות מהמציאות. בדיוק המאפיינים האלה מציבים אותו בשלב הקונקרטי, לא לפניו ולא אחריו (Babakr et al., 2019).</w:t>
+        <w:t>כרים, בן תשע, נמצא בבירור בשלב המבצעים הקונקרטיים, ואפשר לראות את זה בפעולות שלו. הוא כבר שולט בשימור, כלומר מבין שכמות נשארת אותה כמות גם כשמשנים את הצורה, ואם שופכים מיץ לכוס אחרת הוא יודע שלא נהיה יותר. יש לו גם הפיכות בחשיבה, הוא מסוגל לעקוב אחרי פעולה ולהחזיר אותה אחורה בראש. הכי בולט אצלו זה המיון והסיווג. את אוסף קלפי הכדורגל שלו הוא מסדר לפי ליגות, אחר כך לפי קבוצות, ואז לפי עמדות, וממיין אותם שוב ושוב לפי קטגוריה אחרת בכל פעם. הוא תופס חוקי משחק מסובכים ומקפיד עליהם עד הפרט האחרון. אבל כשמנסים לדבר איתו על משהו מופשט ותאורטי, כמו "מה היה קורה אם לא היה כוח משיכה", הוא מתקשה ונאחז בדוגמאות ממשיות מהחיים, וזה בדיוק הגבול של השלב הקונקרטי, שעדיין קשור למוחשי ולא עובר עוד לחשיבה מופשטת (Babakr et al., 2019).</w:t>
       </w:r>
     </w:p>
     <w:p>
@@ -355,7 +371,7 @@
           <w:sz w:val="24"/>
           <w:rtl w:val="1"/>
         </w:rPr>
-        <w:t>הניסוי שנועד לזהות את סוג ההתקשרות של התינוק בנוי מרצף של שבע אפיזודות. בתחילה מכניסים את ההורה ואת התינוק לחדר לא מוכר, והנסיינית עוזבת אותם. לאחר מכן ההורה יושב במקומו והתינוק מוזמן לשחק ולחקור, כשההורה זמין לו כבסיס בטוח. בהמשך נכנסת אישה זרה שמנהלת שיחה עם ההורה ולאט לאט פונה אל התינוק. אז מגיעה ההיפרדות הראשונה, שבה ההורה יוצא מהחדר והתינוק נותר עם הזרה בלבד. אחריה בא האיחוד הראשון, שבו ההורה שב, מרגיע את התינוק, והזרה מסתלקת. בשלב הבא מתרחשת היפרדות שנייה, והפעם התינוק נשאר לגמרי לבד בחדר. לבסוף הזרה חוזרת, ובעקבותיה ההורה, שמסיים את הרצף ואוסף את התינוק אליו. התגובות של התינוק לאורך הרצף, במיוחד ברגעי החזרה של ההורה, הן שמלמדות על טיב ההתקשרות (van IJzendoorn &amp; Kroonenberg, 1988).</w:t>
+        <w:t>ניסוי מצב הזר נבנה כדי לזהות את סוג ההתקשרות בין תינוק לדמות המטפלת, והוא מורכב משבע אפיזודות קצרות שמעלות את המתח בהדרגה. בראשונה מכניסים את ההורה והתינוק לחדר משחקים לא מוכר, והנסיינית יוצאת. בשנייה ההורה יושב והתינוק חופשי לחקור ולשחק, כשההורה משמש לו בסיס בטוח. בשלישית נכנסת דמות זרה, מדברת עם ההורה ומתקרבת לאט לתינוק. ברביעית מגיעה ההיפרדות הראשונה, ההורה יוצא והתינוק נשאר עם הזרה. בחמישית בא האיחוד הראשון, ההורה חוזר ומרגיע, והזרה יוצאת. בשישית מתרחשת ההיפרדות השנייה, וההורה יוצא כך שהתינוק נשאר לבד לגמרי. בשביעית הזרה חוזרת, ואחריה ההורה, שאוסף את התינוק. מהתגובות לאורך הרצף, ובעיקר מרגעי האיחוד, זיהו החוקרים ארבעה סוגים של התקשרות: בטוחה, נמנעת, חרדה-אמביוולנטית, ולא מאורגנת. מעניין שכשבדקו את הדפוסים האלה בין תרבויות שונות, מצאו שההתקשרות הבטוחה נפוצה בכולן, אבל השכיחות של הסוגים האחרים משתנה מחברה לחברה (van IJzendoorn &amp; Kroonenberg, 1988).</w:t>
       </w:r>
     </w:p>
     <w:p>
@@ -371,7 +387,7 @@
           <w:sz w:val="24"/>
           <w:rtl w:val="1"/>
         </w:rPr>
-        <w:t>את כרים מאפיינת התקשרות חרדה-אמביוולנטית. בתקופה שבה נולד אחיו הקטן ואמו טיפלה במקביל בסבתא חולה, התגובות שלה כלפיו היו לא עקביות, לפעמים זמינה מאוד ולפעמים עסוקה, וכרים למד שאי אפשר להיות בטוח מה יקבל. בניסוי מסוג זה ילד כזה נסער מאוד בהיפרדות, אך באיחוד קשה להרגיע אותו, והוא מתנדנד בין רצון להיצמד לבין דחייה. גם היום הוא זקוק להרבה אישורים חוזרים, מתקשה במעברים, ונצמד לאמו יותר מבני גילו. כשהתחיל בית ספר חדש הוא בכה בכניסה כמה בקרים ברציפות והתקשה להיפרד. הדפוס הזה משפיע על הקשרים שלו, שכן הוא נוטה לחשוש שיינטש ולכן בודק שוב ושוב שהאהבה עדיין שם.</w:t>
+        <w:t>את כרים מאפיינת התקשרות חרדה-אמביוולנטית. בתקופה שבה נולד אחיו הקטן ואמו טיפלה במקביל בסבתא חולה, התגובות שלה כלפיו היו לא עקביות, לפעמים זמינה מאוד ולפעמים עסוקה ומרוחקת, וכרים למד שאי אפשר לדעת מראש מה הוא יקבל. מתוך החוויה הזאת הוא בנה לעצמו מודל פנימי מלא ספק, ציפייה שהקרבה עלולה להיעלם בכל רגע. בניסוי כזה ילד כמוהו נסער מאוד בהיפרדות, אבל באיחוד קשה להרגיע אותו, והוא מתנדנד בין רצון להיצמד לבין דחייה. גם היום אפשר לראות את זה. הוא זקוק להרבה אישורים חוזרים, מתקשה במעברים, ונצמד לאמא יותר מבני גילו. כשהתחיל בית ספר חדש הוא בכה בכניסה כמה בקרים ברצף. הדפוס הזה משפיע על הקשרים שלו, כי הוא נוטה לחשוש שיינטש, ולכן בודק שוב ושוב שהאהבה עדיין שם.</w:t>
       </w:r>
     </w:p>
     <w:p>
@@ -403,7 +419,7 @@
           <w:sz w:val="24"/>
           <w:rtl w:val="1"/>
         </w:rPr>
-        <w:t>גרדנר יצא בתיאוריית ריבוי האינטליגנציות כדי לערער על הרעיון שאפשר לסכם את החוכמה של אדם במספר אחד. לטענתו קיימים כמה ערוצים נפרדים של אינטליגנציה, ואצל כל אדם הם מפותחים במידה שונה. שמונת הסוגים שהוא מנה הם: לשונית, השליטה בשפה ובמילים. לוגית-מתמטית, החשיבה בהיגיון ובמספרים. חזותית-מרחבית, ההתמצאות במרחב ובדימויים. מוזיקלית, החישה של צליל וקצב. גופנית-תנועתית, השליטה המדויקת בגוף. בין-אישית, הרגישות לאנשים אחרים. תוך-אישית, ההיכרות עם העולם הפנימי. וטבעונית, החיבור והרגישות לטבע.</w:t>
+        <w:t>תיאוריית ריבוי האינטליגנציות של גרדנר יצאה נגד התפיסה הישנה שאפשר לסכם את החוכמה של אדם בציון משכל אחד, ה-IQ, שנשען בעיקר על יכולת מילולית ומתמטית. גרדנר טען שקיימים כמה ערוצים נפרדים של אינטליגנציה, ולכל אדם תמהיל אחר שלהם. שמונת הסוגים שהוא מנה הם: לשונית, של שפה ומילים. לוגית-מתמטית, של מספרים והיגיון. חזותית-מרחבית, של התמצאות במרחב ובדימויים. מוזיקלית, של צליל, קצב ומנגינה. גופנית-תנועתית, של שליטה מדויקת בגוף ובתנועה. בין-אישית, של קריאת אנשים אחרים. תוך-אישית, של היכרות עם העולם הפנימי. וטבעונית, של רגישות לטבע. הכוח של הגישה הזאת הוא שהיא מסתכלת על ילד דרך מה שהוא כן יכול, ולא רק דרך מה שהוא מתקשה בו.</w:t>
       </w:r>
     </w:p>
     <w:p>
@@ -419,7 +435,7 @@
           <w:sz w:val="24"/>
           <w:rtl w:val="1"/>
         </w:rPr>
-        <w:t>בכרים בולטת האינטליגנציה הגופנית-תנועתית. הגוף שלו הוא כלי החשיבה והביטוי המרכזי שלו, והוא לומד תנועות חדשות במגרש כמעט בהצצה אחת. לצידה ניכרת גם נטייה מוזיקלית חזקה, שמתבטאת בתופים שהוא מנגן בהם בקצב מדויק להפליא. פעם המורה הראה תרגיל כדורגל מסובך פעם אחת, וכרים חזר עליו מיד בצורה מושלמת בזמן שילדים אחרים עוד ניסו להבין. דרך הגוף והתנועה הוא גם מבטא רגשות שקשה לו להוציא במילים, ושם, במגרש ועל התופים, הוא מרגיש הכי מוצלח ובטוח בעצמו.</w:t>
+        <w:t>בכרים בולטת האינטליגנציה הגופנית-תנועתית. הגוף שלו הוא כלי החשיבה והביטוי המרכזי, והוא לומד תנועה חדשה במגרש כמעט בהצצה אחת. לצידה ניכרת גם נטייה מוזיקלית חזקה, שמתבטאת בתופים שהוא מנגן בהם בקצב מדויק להפליא. פעם המורה הראה תרגיל כדורגל מסובך פעם אחת, וכרים חזר עליו מיד בצורה מושלמת בזמן שילדים אחרים עוד ניסו להבין מה קרה. הוא עושה את זה מתוך מוטיבציה פנימית, כי התנועה עצמה מהנה לו ולא בשביל פרס. דרך הגוף והתנועה הוא גם מבטא רגשות שקשה לו להוציא במילים, ושם, במגרש ועל התופים, הוא מרגיש הכי מוצלח ובטוח בעצמו. אם המערכת סביבו תזהה את החוזקה הזאת ותבנה עליה, במקום להילחם רק בחוסר השקט, יש סיכוי טוב שהיא תסחוב איתה גם הישגים בתחומים אחרים.</w:t>
       </w:r>
     </w:p>
     <w:p>

</xml_diff>

<commit_message>
Add Ono logo to covers, set Khloud ID, suppress spell-check underlines
Insert the Ono Academic College logo at the top of both cover pages,
fill Khloud Abu Abbas's ID number, tag every run as Hebrew (he-IL) and
mark it noProof so Word shows no red spelling or green grammar
underlines.

Co-Authored-By: Claude Opus 4.8 <noreply@anthropic.com>
Claude-Session: https://claude.ai/code/session_01AyJnwyA5PYu9UJAEgt6rGo
</commit_message>
<xml_diff>
--- a/עבודה_פסיכולוגיה_התפתחותית_חולוד_אבו_עבאס_כרים.docx
+++ b/עבודה_פסיכולוגיה_התפתחותית_חולוד_אבו_עבאס_כרים.docx
@@ -5,7 +5,7 @@
     <w:p>
       <w:pPr>
         <w:bidi/>
-        <w:spacing w:after="800" w:before="0" w:line="360" w:lineRule="auto"/>
+        <w:spacing w:after="480" w:before="0" w:line="360" w:lineRule="auto"/>
         <w:jc w:val="right"/>
       </w:pPr>
       <w:r>
@@ -13,8 +13,50 @@
           <w:rFonts w:ascii="David" w:hAnsi="David" w:cs="David"/>
           <w:b w:val="0"/>
           <w:sz w:val="24"/>
+          <w:noProof/>
           <w:rtl w:val="1"/>
+          <w:lang w:val="he-IL" w:bidi="he-IL"/>
         </w:rPr>
+      </w:r>
+    </w:p>
+    <w:p>
+      <w:pPr>
+        <w:spacing w:after="280"/>
+        <w:jc w:val="center"/>
+      </w:pPr>
+      <w:r>
+        <w:drawing>
+          <wp:inline xmlns:a="http://schemas.openxmlformats.org/drawingml/2006/main" xmlns:pic="http://schemas.openxmlformats.org/drawingml/2006/picture">
+            <wp:extent cx="1554480" cy="1554480"/>
+            <wp:docPr id="1" name="Picture 1"/>
+            <wp:cNvGraphicFramePr>
+              <a:graphicFrameLocks noChangeAspect="1"/>
+            </wp:cNvGraphicFramePr>
+            <a:graphic>
+              <a:graphicData uri="http://schemas.openxmlformats.org/drawingml/2006/picture">
+                <pic:pic>
+                  <pic:nvPicPr>
+                    <pic:cNvPr id="0" name="f4bc9b95-IMG_3708.jpeg"/>
+                    <pic:cNvPicPr/>
+                  </pic:nvPicPr>
+                  <pic:blipFill>
+                    <a:blip r:embed="rId9"/>
+                    <a:stretch>
+                      <a:fillRect/>
+                    </a:stretch>
+                  </pic:blipFill>
+                  <pic:spPr>
+                    <a:xfrm>
+                      <a:off x="0" y="0"/>
+                      <a:ext cx="1554480" cy="1554480"/>
+                    </a:xfrm>
+                    <a:prstGeom prst="rect"/>
+                  </pic:spPr>
+                </pic:pic>
+              </a:graphicData>
+            </a:graphic>
+          </wp:inline>
+        </w:drawing>
       </w:r>
     </w:p>
     <w:p>
@@ -28,7 +70,9 @@
           <w:rFonts w:ascii="David" w:hAnsi="David" w:cs="David"/>
           <w:b/>
           <w:sz w:val="32"/>
+          <w:noProof/>
           <w:rtl w:val="1"/>
+          <w:lang w:val="he-IL" w:bidi="he-IL"/>
         </w:rPr>
         <w:t>הקריה האקדמית אונו</w:t>
       </w:r>
@@ -44,7 +88,9 @@
           <w:rFonts w:ascii="David" w:hAnsi="David" w:cs="David"/>
           <w:b/>
           <w:sz w:val="26"/>
+          <w:noProof/>
           <w:rtl w:val="1"/>
+          <w:lang w:val="he-IL" w:bidi="he-IL"/>
         </w:rPr>
         <w:t>הפקולטה למדעי הרוח והחברה</w:t>
       </w:r>
@@ -60,7 +106,9 @@
           <w:rFonts w:ascii="David" w:hAnsi="David" w:cs="David"/>
           <w:b/>
           <w:sz w:val="30"/>
+          <w:noProof/>
           <w:rtl w:val="1"/>
+          <w:lang w:val="he-IL" w:bidi="he-IL"/>
         </w:rPr>
         <w:t>פסיכולוגיה התפתחותית א' - ינקות והתבגרות (מקוון)</w:t>
       </w:r>
@@ -76,7 +124,9 @@
           <w:rFonts w:ascii="David" w:hAnsi="David" w:cs="David"/>
           <w:b/>
           <w:sz w:val="28"/>
+          <w:noProof/>
           <w:rtl w:val="1"/>
+          <w:lang w:val="he-IL" w:bidi="he-IL"/>
         </w:rPr>
         <w:t>עבודה מסכמת</w:t>
       </w:r>
@@ -92,7 +142,9 @@
           <w:rFonts w:ascii="David" w:hAnsi="David" w:cs="David"/>
           <w:b w:val="0"/>
           <w:sz w:val="24"/>
+          <w:noProof/>
           <w:rtl w:val="1"/>
+          <w:lang w:val="he-IL" w:bidi="he-IL"/>
         </w:rPr>
         <w:t>מרצים: פרופ' טובה הרטמן וד"ר צפירה גרבלסקי-ליכטמן</w:t>
       </w:r>
@@ -108,9 +160,11 @@
           <w:rFonts w:ascii="David" w:hAnsi="David" w:cs="David"/>
           <w:b/>
           <w:sz w:val="24"/>
+          <w:noProof/>
           <w:rtl w:val="1"/>
+          <w:lang w:val="he-IL" w:bidi="he-IL"/>
         </w:rPr>
-        <w:t>מגישה: חולוד אבו עבאס     ת"ז: ______________</w:t>
+        <w:t>מגישה: חולוד אבו עבאס     ת"ז: 206711566</w:t>
       </w:r>
     </w:p>
     <w:p>
@@ -124,7 +178,9 @@
           <w:rFonts w:ascii="David" w:hAnsi="David" w:cs="David"/>
           <w:b w:val="0"/>
           <w:sz w:val="24"/>
+          <w:noProof/>
           <w:rtl w:val="1"/>
+          <w:lang w:val="he-IL" w:bidi="he-IL"/>
         </w:rPr>
         <w:t>תאריך הגשה: 22.7.2026</w:t>
       </w:r>
@@ -145,7 +201,9 @@
           <w:rFonts w:ascii="David" w:hAnsi="David" w:cs="David"/>
           <w:b/>
           <w:sz w:val="24"/>
+          <w:noProof/>
           <w:rtl w:val="1"/>
+          <w:lang w:val="he-IL" w:bidi="he-IL"/>
         </w:rPr>
         <w:t>שאלה 1 - סיפור מקרה</w:t>
       </w:r>
@@ -161,7 +219,9 @@
           <w:rFonts w:ascii="David" w:hAnsi="David" w:cs="David"/>
           <w:b w:val="0"/>
           <w:sz w:val="24"/>
+          <w:noProof/>
           <w:rtl w:val="1"/>
+          <w:lang w:val="he-IL" w:bidi="he-IL"/>
         </w:rPr>
         <w:t>כרים הוא ילד בן תשע, הרביעי מבין חמישה אחים, שגדל במשפחה גדולה וחמה בעיר בצפון. בבית גרים ההורים, האחים והסבתא, וכל היום יש תנועה של קרובים שנכנסים ויוצאים. אני מכירה את כרים כי אני בת דודה של אמו, וראיתי אותו גדל מקרוב. אם בוחנים את ההתפתחות שלו לפי תיאוריית משך החיים, שרואה את החיים כרצף של תקופות, כרים נמצא באמצע הילדות, בגיל בית הספר היסודי, וזה בדיוק הגיל שבו רואים קפיצה גדולה ביכולות. מבחינת ההתפתחות הנורמטיבית, כלומר מה שנמצא בתוך ההתפלגות הרגילה של בני גילו, הכול אצלו זרם בקצב תקין. הוא זחל, עמד והלך עוד לפני גיל שנה, דיבר במשפטים שלמים סביב גיל שנתיים, והיום הוא קורא, כותב ופותר תרגילי חשבון כמו רוב הילדים בכיתה.</w:t>
       </w:r>
@@ -177,7 +237,9 @@
           <w:rFonts w:ascii="David" w:hAnsi="David" w:cs="David"/>
           <w:b w:val="0"/>
           <w:sz w:val="24"/>
+          <w:noProof/>
           <w:rtl w:val="1"/>
+          <w:lang w:val="he-IL" w:bidi="he-IL"/>
         </w:rPr>
         <w:t>הייחוד של כרים מתחיל דווקא בגוף. הפנוטיפ שלו, מה שרואים בהתנהגות הגלויה, הוא של ילד אתלטי וזריז במיוחד, שלומד כל מיומנות גופנית כמעט מיד. קרוב לוודאי שיש כאן שילוב בין הגנוטיפ, נטייה שהוא נולד איתה, לבין סביבה שבה כדורגל ותנועה הם חלק מהיום יום. מצד שני, לשבת בשקט מול מחברת זה עונש בשבילו. בכיתה הוא נע כל הזמן, קופץ ממקום למקום, ולפעמים מסתבך בגלל חוסר השקט. מבחינת ההסתגלות, כרים מסתגל מהר למצבים חדשים כשהם כוללים תנועה או קבוצה, אבל מתקשה יותר במסגרות שדורשות ישיבה ממושכת. אז מצד אחד יש התפתחות תקינה לגמרי, ומצד שני פרופיל אישי מאוד מובהק, כישרון תנועתי גבוה לצד קושי בריכוז, וזה מה שהופך אותו לכרים ולא לילד אחר.</w:t>
       </w:r>
@@ -193,7 +255,9 @@
           <w:rFonts w:ascii="David" w:hAnsi="David" w:cs="David"/>
           <w:b/>
           <w:sz w:val="24"/>
+          <w:noProof/>
           <w:rtl w:val="1"/>
+          <w:lang w:val="he-IL" w:bidi="he-IL"/>
         </w:rPr>
         <w:t>שאלה 2 - גורמי סיכון וגורמי מגן</w:t>
       </w:r>
@@ -209,7 +273,9 @@
           <w:rFonts w:ascii="David" w:hAnsi="David" w:cs="David"/>
           <w:b w:val="0"/>
           <w:sz w:val="24"/>
+          <w:noProof/>
           <w:rtl w:val="1"/>
+          <w:lang w:val="he-IL" w:bidi="he-IL"/>
         </w:rPr>
         <w:t>גורמי סיכון הם תנאים, בילד עצמו או בסביבה שלו, שמגדילים את הסיכוי שההתפתחות תיתקל בקשיים. גורמי מגן הם ההפך, תנאים שמגנים על הילד, מרככים את הפגיעה של הסיכון ומחזקים את החוסן שלו. הסיכון והמגן יכולים להיות פנימיים, כמו מזג או קושי בריכוז, או חיצוניים, כמו צפיפות בבית ומצב כלכלי. בדרך כלל לא גורם אחד מכריע אלא ההצטברות של כמה, וגם ההפך נכון, שלפעמים דמות מבוגרת אחת שמאמינה בילד מספיקה כדי לאזן הרבה ולבנות חוסן.</w:t>
       </w:r>
@@ -225,7 +291,9 @@
           <w:rFonts w:ascii="David" w:hAnsi="David" w:cs="David"/>
           <w:b w:val="0"/>
           <w:sz w:val="24"/>
+          <w:noProof/>
           <w:rtl w:val="1"/>
+          <w:lang w:val="he-IL" w:bidi="he-IL"/>
         </w:rPr>
         <w:t>בסביבה של כרים יש כמה גורמי סיכון אמיתיים. הבית צפוף, שבעה אנשים בדירה קטנה, וכמעט אין פינה שקטה להכין בה שיעורים. אח בכור שלו מתמודד עם לקות למידה ומושך אליו הרבה מהתשומת לב של ההורים. האב עובד שעות ארוכות בבניין וכמעט לא נמצא בבית בשעות היום, כך שהזמינות שלו מוגבלת. ואי השקט של כרים עצמו מכניס אותו לחיכוכים חוזרים עם המורים. אבל מולם עומדים גם גורמי מגן חזקים. המשפחה המורחבת מלוכדת, הסבתא נוכחת כל היום ונותנת יציבות, ויש תחושת קהילה חזקה בשכונה שכולם מכירים בה זה את זה. הנקודה שבאמת שינתה משהו היא מורה לחינוך גופני שזיהה את הכישרון שלו, מינה אותו לקפטן והטיל עליו אחריות. מרגע שכרים קיבל תפקיד וחיזוקים חיוביים על ההתנהגות שלו במגרש, הביטחון העצמי שלו עלה, וזה גלש בהדרגה גם לכיתה. הקשר החם עם אמא וההצלחות במגרש הם העוגן שמאזן חלק גדול מהסיכון (Masten, 2001).</w:t>
       </w:r>
@@ -241,7 +309,9 @@
           <w:rFonts w:ascii="David" w:hAnsi="David" w:cs="David"/>
           <w:b/>
           <w:sz w:val="24"/>
+          <w:noProof/>
           <w:rtl w:val="1"/>
+          <w:lang w:val="he-IL" w:bidi="he-IL"/>
         </w:rPr>
         <w:t>שאלה 3 - מעגלי השפעה</w:t>
       </w:r>
@@ -257,7 +327,9 @@
           <w:rFonts w:ascii="David" w:hAnsi="David" w:cs="David"/>
           <w:b w:val="0"/>
           <w:sz w:val="24"/>
+          <w:noProof/>
           <w:rtl w:val="1"/>
+          <w:lang w:val="he-IL" w:bidi="he-IL"/>
         </w:rPr>
         <w:t>מעגלי ההשפעה, לפי המודל האקולוגי, מציגים את ההתפתחות כמשהו שקורה בתוך כמה מעגלים סביבתיים שמקיפים את הילד, מהקרוב אליו ועד הרחוק. במרכז נמצא המיקרו-מערכת, כל מה שהילד במגע ישיר ויומיומי איתו, המשפחה, בית הספר וקבוצת הכדורגל. אצל כרים הקבוצה היא כמעט בית שני, המקום שבו הוא מרגיש מוצלח ושייך, ואפשר לראות איך אימון אחד בשבוע מחזיק לו את הביטחון גם בימים פחות טובים.</w:t>
       </w:r>
@@ -273,7 +345,9 @@
           <w:rFonts w:ascii="David" w:hAnsi="David" w:cs="David"/>
           <w:b w:val="0"/>
           <w:sz w:val="24"/>
+          <w:noProof/>
           <w:rtl w:val="1"/>
+          <w:lang w:val="he-IL" w:bidi="he-IL"/>
         </w:rPr>
         <w:t>המזו-מערכת היא רשת הקשרים בין חלקי המיקרו, מה שקורה כשהם נפגשים זה עם זה. הדוגמה הטובה אצל כרים היא הפגישה בין המאמן להורים. כשהמאמן סיפר להם כמה כרים אחראי במגרש, ההורים התחילו להסתכל עליו אחרת גם בבית, והמורה בכיתה נתנה לו יותר מקום להוציא אנרגיה. האקסו-מערכת כוללת מסגרות שכרים עצמו לא נמצא בהן, אבל הן משפיעות עליו דרך אחרים. שעות העבודה הארוכות של אבא בבניין, החלטה כלכלית שכרים לא היה שותף לה, קובעות בפועל כמה הוא בכלל רואה את אבא במהלך השבוע.</w:t>
       </w:r>
@@ -289,7 +363,9 @@
           <w:rFonts w:ascii="David" w:hAnsi="David" w:cs="David"/>
           <w:b w:val="0"/>
           <w:sz w:val="24"/>
+          <w:noProof/>
           <w:rtl w:val="1"/>
+          <w:lang w:val="he-IL" w:bidi="he-IL"/>
         </w:rPr>
         <w:t>המקרו-מערכת היא רובד התרבות, הערכים והמצב הכלכלי-חברתי. כרים גדל בחברה ערבית מסורתית שמעמידה את המשפחה המורחבת במרכז, וזה נותן לו רשת תמיכה רחבה של דודים, בני דודים וסבתא, אבל גם מציב עליו ציפיות ותפקידים כבן במשפחה. לפי הגישה ההתנהגותית, הסביבה הרחבה הזאת היא שמכתיבה אילו התנהגויות ייחשבו רצויות ויזכו לעידוד. הכרונו-מערכת היא ממד הזמן, השינויים והמעברים לאורך החיים. המעבר לשכונה חדשה ובואה של הסבתא לגור בבית היו שני אירועים שעיצבו מחדש את המרקם המשפחתי. והמעגלים לא עובדים בנפרד, כניסת הסבתא הביתה, שהיא אירוע בזמן, שינתה את חלוקת התפקידים במיקרו והוסיפה לכרים דמות מבוגרת זמינה בדיוק כשאמא הייתה עמוסה (דרייפוס-חנן, 2024).</w:t>
       </w:r>
@@ -305,7 +381,9 @@
           <w:rFonts w:ascii="David" w:hAnsi="David" w:cs="David"/>
           <w:b/>
           <w:sz w:val="24"/>
+          <w:noProof/>
           <w:rtl w:val="1"/>
+          <w:lang w:val="he-IL" w:bidi="he-IL"/>
         </w:rPr>
         <w:t>שאלה 4 - תיאוריית ההתפתחות הקוגניטיבית (פיאז'ה)</w:t>
       </w:r>
@@ -321,7 +399,9 @@
           <w:rFonts w:ascii="David" w:hAnsi="David" w:cs="David"/>
           <w:b w:val="0"/>
           <w:sz w:val="24"/>
+          <w:noProof/>
           <w:rtl w:val="1"/>
+          <w:lang w:val="he-IL" w:bidi="he-IL"/>
         </w:rPr>
         <w:t>פיאז'ה תיאר ארבעה שלבים ברצף ההתפתחות הקוגניטיבית, כשלכל שלב טווח גיל משוער. הראשון הוא השלב הסנסומוטורי, מהלידה ועד גיל שנתיים. אחריו השלב הקדם-מבצעי, בין גיל שנתיים לשבע. השלישי הוא שלב המבצעים הקונקרטיים, בין גיל שבע לאחת עשרה. והאחרון הוא שלב המבצעים הפורמליים, מגיל אחת עשרה והלאה. לפי פיאז'ה הילד בונה את הידע בעצמו דרך סכימות, ומתקדם משלב לשלב כשהוא נתקל במשהו שלא מסתדר עם הסכימה הקיימת, נכנס לחוסר איזון, ונאלץ להתאים את החשיבה שלו כדי לקלוט את המציאות החדשה.</w:t>
       </w:r>
@@ -337,7 +417,9 @@
           <w:rFonts w:ascii="David" w:hAnsi="David" w:cs="David"/>
           <w:b w:val="0"/>
           <w:sz w:val="24"/>
+          <w:noProof/>
           <w:rtl w:val="1"/>
+          <w:lang w:val="he-IL" w:bidi="he-IL"/>
         </w:rPr>
         <w:t>כרים, בן תשע, נמצא בבירור בשלב המבצעים הקונקרטיים, ואפשר לראות את זה בפעולות שלו. הוא כבר שולט בשימור, כלומר מבין שכמות נשארת אותה כמות גם כשמשנים את הצורה, ואם שופכים מיץ לכוס אחרת הוא יודע שלא נהיה יותר. יש לו גם הפיכות בחשיבה, הוא מסוגל לעקוב אחרי פעולה ולהחזיר אותה אחורה בראש. הכי בולט אצלו זה המיון והסיווג. את אוסף קלפי הכדורגל שלו הוא מסדר לפי ליגות, אחר כך לפי קבוצות, ואז לפי עמדות, וממיין אותם שוב ושוב לפי קטגוריה אחרת בכל פעם. הוא תופס חוקי משחק מסובכים ומקפיד עליהם עד הפרט האחרון. אבל כשמנסים לדבר איתו על משהו מופשט ותאורטי, כמו "מה היה קורה אם לא היה כוח משיכה", הוא מתקשה ונאחז בדוגמאות ממשיות מהחיים, וזה בדיוק הגבול של השלב הקונקרטי, שעדיין קשור למוחשי ולא עובר עוד לחשיבה מופשטת (Babakr et al., 2019).</w:t>
       </w:r>
@@ -353,7 +435,9 @@
           <w:rFonts w:ascii="David" w:hAnsi="David" w:cs="David"/>
           <w:b/>
           <w:sz w:val="24"/>
+          <w:noProof/>
           <w:rtl w:val="1"/>
+          <w:lang w:val="he-IL" w:bidi="he-IL"/>
         </w:rPr>
         <w:t>שאלה 5 - ניסוי מצב הזר</w:t>
       </w:r>
@@ -369,7 +453,9 @@
           <w:rFonts w:ascii="David" w:hAnsi="David" w:cs="David"/>
           <w:b w:val="0"/>
           <w:sz w:val="24"/>
+          <w:noProof/>
           <w:rtl w:val="1"/>
+          <w:lang w:val="he-IL" w:bidi="he-IL"/>
         </w:rPr>
         <w:t>ניסוי מצב הזר נבנה כדי לזהות את סוג ההתקשרות בין תינוק לדמות המטפלת, והוא מורכב משבע אפיזודות קצרות שמעלות את המתח בהדרגה. בראשונה מכניסים את ההורה והתינוק לחדר משחקים לא מוכר, והנסיינית יוצאת. בשנייה ההורה יושב והתינוק חופשי לחקור ולשחק, כשההורה משמש לו בסיס בטוח. בשלישית נכנסת דמות זרה, מדברת עם ההורה ומתקרבת לאט לתינוק. ברביעית מגיעה ההיפרדות הראשונה, ההורה יוצא והתינוק נשאר עם הזרה. בחמישית בא האיחוד הראשון, ההורה חוזר ומרגיע, והזרה יוצאת. בשישית מתרחשת ההיפרדות השנייה, וההורה יוצא כך שהתינוק נשאר לבד לגמרי. בשביעית הזרה חוזרת, ואחריה ההורה, שאוסף את התינוק. מהתגובות לאורך הרצף, ובעיקר מרגעי האיחוד, זיהו החוקרים ארבעה סוגים של התקשרות: בטוחה, נמנעת, חרדה-אמביוולנטית, ולא מאורגנת. מעניין שכשבדקו את הדפוסים האלה בין תרבויות שונות, מצאו שההתקשרות הבטוחה נפוצה בכולן, אבל השכיחות של הסוגים האחרים משתנה מחברה לחברה (van IJzendoorn &amp; Kroonenberg, 1988).</w:t>
       </w:r>
@@ -385,7 +471,9 @@
           <w:rFonts w:ascii="David" w:hAnsi="David" w:cs="David"/>
           <w:b w:val="0"/>
           <w:sz w:val="24"/>
+          <w:noProof/>
           <w:rtl w:val="1"/>
+          <w:lang w:val="he-IL" w:bidi="he-IL"/>
         </w:rPr>
         <w:t>את כרים מאפיינת התקשרות חרדה-אמביוולנטית. בתקופה שבה נולד אחיו הקטן ואמו טיפלה במקביל בסבתא חולה, התגובות שלה כלפיו היו לא עקביות, לפעמים זמינה מאוד ולפעמים עסוקה ומרוחקת, וכרים למד שאי אפשר לדעת מראש מה הוא יקבל. מתוך החוויה הזאת הוא בנה לעצמו מודל פנימי מלא ספק, ציפייה שהקרבה עלולה להיעלם בכל רגע. בניסוי כזה ילד כמוהו נסער מאוד בהיפרדות, אבל באיחוד קשה להרגיע אותו, והוא מתנדנד בין רצון להיצמד לבין דחייה. גם היום אפשר לראות את זה. הוא זקוק להרבה אישורים חוזרים, מתקשה במעברים, ונצמד לאמא יותר מבני גילו. כשהתחיל בית ספר חדש הוא בכה בכניסה כמה בקרים ברצף. הדפוס הזה משפיע על הקשרים שלו, כי הוא נוטה לחשוש שיינטש, ולכן בודק שוב ושוב שהאהבה עדיין שם.</w:t>
       </w:r>
@@ -401,7 +489,9 @@
           <w:rFonts w:ascii="David" w:hAnsi="David" w:cs="David"/>
           <w:b/>
           <w:sz w:val="24"/>
+          <w:noProof/>
           <w:rtl w:val="1"/>
+          <w:lang w:val="he-IL" w:bidi="he-IL"/>
         </w:rPr>
         <w:t>שאלה 6 - תיאוריית ריבוי האינטליגנציות</w:t>
       </w:r>
@@ -417,7 +507,9 @@
           <w:rFonts w:ascii="David" w:hAnsi="David" w:cs="David"/>
           <w:b w:val="0"/>
           <w:sz w:val="24"/>
+          <w:noProof/>
           <w:rtl w:val="1"/>
+          <w:lang w:val="he-IL" w:bidi="he-IL"/>
         </w:rPr>
         <w:t>תיאוריית ריבוי האינטליגנציות של גרדנר יצאה נגד התפיסה הישנה שאפשר לסכם את החוכמה של אדם בציון משכל אחד, ה-IQ, שנשען בעיקר על יכולת מילולית ומתמטית. גרדנר טען שקיימים כמה ערוצים נפרדים של אינטליגנציה, ולכל אדם תמהיל אחר שלהם. שמונת הסוגים שהוא מנה הם: לשונית, של שפה ומילים. לוגית-מתמטית, של מספרים והיגיון. חזותית-מרחבית, של התמצאות במרחב ובדימויים. מוזיקלית, של צליל, קצב ומנגינה. גופנית-תנועתית, של שליטה מדויקת בגוף ובתנועה. בין-אישית, של קריאת אנשים אחרים. תוך-אישית, של היכרות עם העולם הפנימי. וטבעונית, של רגישות לטבע. הכוח של הגישה הזאת הוא שהיא מסתכלת על ילד דרך מה שהוא כן יכול, ולא רק דרך מה שהוא מתקשה בו.</w:t>
       </w:r>
@@ -433,7 +525,9 @@
           <w:rFonts w:ascii="David" w:hAnsi="David" w:cs="David"/>
           <w:b w:val="0"/>
           <w:sz w:val="24"/>
+          <w:noProof/>
           <w:rtl w:val="1"/>
+          <w:lang w:val="he-IL" w:bidi="he-IL"/>
         </w:rPr>
         <w:t>בכרים בולטת האינטליגנציה הגופנית-תנועתית. הגוף שלו הוא כלי החשיבה והביטוי המרכזי, והוא לומד תנועה חדשה במגרש כמעט בהצצה אחת. לצידה ניכרת גם נטייה מוזיקלית חזקה, שמתבטאת בתופים שהוא מנגן בהם בקצב מדויק להפליא. פעם המורה הראה תרגיל כדורגל מסובך פעם אחת, וכרים חזר עליו מיד בצורה מושלמת בזמן שילדים אחרים עוד ניסו להבין מה קרה. הוא עושה את זה מתוך מוטיבציה פנימית, כי התנועה עצמה מהנה לו ולא בשביל פרס. דרך הגוף והתנועה הוא גם מבטא רגשות שקשה לו להוציא במילים, ושם, במגרש ועל התופים, הוא מרגיש הכי מוצלח ובטוח בעצמו. אם המערכת סביבו תזהה את החוזקה הזאת ותבנה עליה, במקום להילחם רק בחוסר השקט, יש סיכוי טוב שהיא תסחוב איתה גם הישגים בתחומים אחרים.</w:t>
       </w:r>
@@ -449,7 +543,9 @@
           <w:rFonts w:ascii="David" w:hAnsi="David" w:cs="David"/>
           <w:b/>
           <w:sz w:val="24"/>
+          <w:noProof/>
           <w:rtl w:val="1"/>
+          <w:lang w:val="he-IL" w:bidi="he-IL"/>
         </w:rPr>
         <w:t>רשימת מקורות</w:t>
       </w:r>
@@ -466,7 +562,9 @@
           <w:rFonts w:ascii="David" w:hAnsi="David" w:cs="David"/>
           <w:b w:val="0"/>
           <w:sz w:val="22"/>
+          <w:noProof/>
           <w:rtl w:val="1"/>
+          <w:lang w:val="he-IL" w:bidi="he-IL"/>
         </w:rPr>
         <w:t>דרייפוס-חנן, ש' (2024). שאלה של התמקמות: הפסיכולוגיה החינוכית במרחב הקהילתי. פסיכולוגיה עברית. אוחזר מתוך https://www.hebpsy.net/articles.asp?id=4720</w:t>
       </w:r>
@@ -483,7 +581,9 @@
           <w:rFonts w:ascii="David" w:hAnsi="David" w:cs="David"/>
           <w:b w:val="0"/>
           <w:sz w:val="22"/>
+          <w:noProof/>
           <w:rtl w:val="1"/>
+          <w:lang w:val="he-IL" w:bidi="he-IL"/>
         </w:rPr>
         <w:t>Babakr, Z. H., Mohamedamin, P., &amp; Kakamad, K. (2019). Piaget's cognitive developmental theory: Critical review. Education Quarterly Reviews, 2(3), 517-524.</w:t>
       </w:r>
@@ -500,7 +600,9 @@
           <w:rFonts w:ascii="David" w:hAnsi="David" w:cs="David"/>
           <w:b w:val="0"/>
           <w:sz w:val="22"/>
+          <w:noProof/>
           <w:rtl w:val="1"/>
+          <w:lang w:val="he-IL" w:bidi="he-IL"/>
         </w:rPr>
         <w:t>Masten, A. S. (2001). Ordinary magic: Resilience processes in development. American Psychologist, 56(3), 227-238.</w:t>
       </w:r>
@@ -517,7 +619,9 @@
           <w:rFonts w:ascii="David" w:hAnsi="David" w:cs="David"/>
           <w:b w:val="0"/>
           <w:sz w:val="22"/>
+          <w:noProof/>
           <w:rtl w:val="1"/>
+          <w:lang w:val="he-IL" w:bidi="he-IL"/>
         </w:rPr>
         <w:t>van IJzendoorn, M. H., &amp; Kroonenberg, P. M. (1988). Cross-cultural patterns of attachment: A meta-analysis of the strange situation. Child Development, 59(1), 147-156.</w:t>
       </w:r>
@@ -898,6 +1002,7 @@
     <w:rPr>
       <w:rFonts w:ascii="David" w:hAnsi="David" w:cs="David"/>
       <w:sz w:val="24"/>
+      <w:lang w:val="he-IL" w:bidi="he-IL"/>
     </w:rPr>
   </w:style>
   <w:style w:type="paragraph" w:styleId="Header">

</xml_diff>

<commit_message>
Weave in more course concepts across both papers
Add motivation types (extrinsic/intrinsic), extinction, generalization,
assimilation/accommodation with concrete examples, disequilibrium and
cognitive growth, correlation vs experimental research, and
interpersonal ties, integrated into the prose in both versions.

Co-Authored-By: Claude Opus 4.8 <noreply@anthropic.com>
Claude-Session: https://claude.ai/code/session_01AyJnwyA5PYu9UJAEgt6rGo
</commit_message>
<xml_diff>
--- a/עבודה_פסיכולוגיה_התפתחותית_חולוד_אבו_עבאס_כרים.docx
+++ b/עבודה_פסיכולוגיה_התפתחותית_חולוד_אבו_עבאס_כרים.docx
@@ -241,7 +241,7 @@
           <w:rtl w:val="1"/>
           <w:lang w:val="he-IL" w:bidi="he-IL"/>
         </w:rPr>
-        <w:t>הייחוד של כרים מתחיל דווקא בגוף. הפנוטיפ שלו, מה שרואים בהתנהגות הגלויה, הוא של ילד אתלטי וזריז במיוחד, שלומד כל מיומנות גופנית כמעט מיד. קרוב לוודאי שיש כאן שילוב בין הגנוטיפ, נטייה שהוא נולד איתה, לבין סביבה שבה כדורגל ותנועה הם חלק מהיום יום. מצד שני, לשבת בשקט מול מחברת זה עונש בשבילו. בכיתה הוא נע כל הזמן, קופץ ממקום למקום, ולפעמים מסתבך בגלל חוסר השקט. מבחינת ההסתגלות, כרים מסתגל מהר למצבים חדשים כשהם כוללים תנועה או קבוצה, אבל מתקשה יותר במסגרות שדורשות ישיבה ממושכת. אז מצד אחד יש התפתחות תקינה לגמרי, ומצד שני פרופיל אישי מאוד מובהק, כישרון תנועתי גבוה לצד קושי בריכוז, וזה מה שהופך אותו לכרים ולא לילד אחר.</w:t>
+        <w:t>הייחוד של כרים מתחיל דווקא בגוף. הפנוטיפ שלו, מה שרואים בהתנהגות הגלויה, הוא של ילד אתלטי וזריז במיוחד, שלומד כל מיומנות גופנית כמעט מיד. קרוב לוודאי שיש כאן שילוב בין הגנוטיפ, נטייה שהוא נולד איתה, לבין סביבה שבה כדורגל ותנועה הם חלק מהיום יום. מצד שני, לשבת בשקט מול מחברת זה עונש בשבילו. בכיתה הוא נע כל הזמן, קופץ ממקום למקום, ולפעמים מסתבך בגלל חוסר השקט. מבחינת ההסתגלות, כרים מסתגל מהר למצבים חדשים כשהם כוללים תנועה או קבוצה, אבל מתקשה יותר במסגרות שדורשות ישיבה ממושכת. אז מצד אחד יש התפתחות תקינה לגמרי, ומצד שני פרופיל אישי מאוד מובהק, כישרון תנועתי גבוה לצד קושי בריכוז, וזה מה שהופך אותו לכרים ולא לילד אחר. גם כאן, מבחינה מחקרית, אפשר לדבר רק על קורלציה בין סביבה מלאת תנועה לבין הזריזות שלו, ולא על מחקר ניסוי שמוכיח סיבה ותוצאה, כי מדובר בתצפית על ילד אחד ולא במחקר מבוקר.</w:t>
       </w:r>
     </w:p>
     <w:p>
@@ -295,7 +295,7 @@
           <w:rtl w:val="1"/>
           <w:lang w:val="he-IL" w:bidi="he-IL"/>
         </w:rPr>
-        <w:t>בסביבה של כרים יש כמה גורמי סיכון אמיתיים. הבית צפוף, שבעה אנשים בדירה קטנה, וכמעט אין פינה שקטה להכין בה שיעורים. אח בכור שלו מתמודד עם לקות למידה ומושך אליו הרבה מהתשומת לב של ההורים. האב עובד שעות ארוכות בבניין וכמעט לא נמצא בבית בשעות היום, כך שהזמינות שלו מוגבלת. ואי השקט של כרים עצמו מכניס אותו לחיכוכים חוזרים עם המורים. אבל מולם עומדים גם גורמי מגן חזקים. המשפחה המורחבת מלוכדת, הסבתא נוכחת כל היום ונותנת יציבות, ויש תחושת קהילה חזקה בשכונה שכולם מכירים בה זה את זה. הנקודה שבאמת שינתה משהו היא מורה לחינוך גופני שזיהה את הכישרון שלו, מינה אותו לקפטן והטיל עליו אחריות. מרגע שכרים קיבל תפקיד וחיזוקים חיוביים על ההתנהגות שלו במגרש, הביטחון העצמי שלו עלה, וזה גלש בהדרגה גם לכיתה. הקשר החם עם אמא וההצלחות במגרש הם העוגן שמאזן חלק גדול מהסיכון (Masten, 2001).</w:t>
+        <w:t>בסביבה של כרים יש כמה גורמי סיכון אמיתיים. הבית צפוף, שבעה אנשים בדירה קטנה, וכמעט אין פינה שקטה להכין בה שיעורים. אח בכור שלו מתמודד עם לקות למידה ומושך אליו הרבה מהתשומת לב של ההורים. האב עובד שעות ארוכות בבניין וכמעט לא נמצא בבית בשעות היום, כך שהזמינות שלו מוגבלת. ואי השקט של כרים עצמו מכניס אותו לחיכוכים חוזרים עם המורים. אבל מולם עומדים גם גורמי מגן חזקים. המשפחה המורחבת מלוכדת, הסבתא נוכחת כל היום ונותנת יציבות, ויש תחושת קהילה חזקה בשכונה שכולם מכירים בה זה את זה. הנקודה שבאמת שינתה משהו היא מורה לחינוך גופני שזיהה את הכישרון שלו, מינה אותו לקפטן והטיל עליו אחריות. מרגע שכרים קיבל תפקיד וחיזוקים חיוביים על ההתנהגות שלו במגרש, הביטחון העצמי שלו עלה, וזה גלש בהדרגה גם לכיתה. בהתחלה הוא התאמץ במגרש בעיקר מתוך מוטיבציה חיצונית, בשביל התפקיד וההערכה של המאמן, ולאורך זמן זה הפך למוטיבציה פנימית, כי הוא באמת אוהב את המשחק. את הביטחון שצבר במגרש הוא הכליל גם לתחומים אחרים, ופתאום גם בכיתה הוא העז יותר. הקשר החם עם אמא וההצלחות במגרש הם העוגן שמאזן חלק גדול מהסיכון (Masten, 2001).</w:t>
       </w:r>
     </w:p>
     <w:p>
@@ -403,7 +403,7 @@
           <w:rtl w:val="1"/>
           <w:lang w:val="he-IL" w:bidi="he-IL"/>
         </w:rPr>
-        <w:t>פיאז'ה תיאר ארבעה שלבים ברצף ההתפתחות הקוגניטיבית, כשלכל שלב טווח גיל משוער. הראשון הוא השלב הסנסומוטורי, מהלידה ועד גיל שנתיים. אחריו השלב הקדם-מבצעי, בין גיל שנתיים לשבע. השלישי הוא שלב המבצעים הקונקרטיים, בין גיל שבע לאחת עשרה. והאחרון הוא שלב המבצעים הפורמליים, מגיל אחת עשרה והלאה. לפי פיאז'ה הילד בונה את הידע בעצמו דרך סכימות, ומתקדם משלב לשלב כשהוא נתקל במשהו שלא מסתדר עם הסכימה הקיימת, נכנס לחוסר איזון, ונאלץ להתאים את החשיבה שלו כדי לקלוט את המציאות החדשה.</w:t>
+        <w:t>פיאז'ה תיאר ארבעה שלבים ברצף ההתפתחות הקוגניטיבית, כשלכל שלב טווח גיל משוער. הראשון הוא השלב הסנסומוטורי, מהלידה ועד גיל שנתיים. אחריו השלב הקדם-מבצעי, בין גיל שנתיים לשבע. השלישי הוא שלב המבצעים הקונקרטיים, בין גיל שבע לאחת עשרה. והאחרון הוא שלב המבצעים הפורמליים, מגיל אחת עשרה והלאה. לפי פיאז'ה הילד בונה את הידע בעצמו דרך סכימות, ומתקדם משלב לשלב כשהוא נתקל במשהו שלא מסתדר עם הסכימה הקיימת, נכנס לחוסר איזון, ונאלץ להתאים את החשיבה שלו כדי לקלוט את המציאות החדשה. למשל, כרים היה בטוח הרבה זמן שכל דבר שמשוחרר באוויר נופל למטה, עד שראה בלון הליום עולה. זה יצר אצלו חוסר איזון, והוא נאלץ להתאים את הסכימה ולהוסיף לה חריגים, וזו בדיוק הצמיחה הקוגניטיבית שפיאז'ה דיבר עליה.</w:t>
       </w:r>
     </w:p>
     <w:p>
@@ -475,7 +475,7 @@
           <w:rtl w:val="1"/>
           <w:lang w:val="he-IL" w:bidi="he-IL"/>
         </w:rPr>
-        <w:t>את כרים מאפיינת התקשרות חרדה-אמביוולנטית. בתקופה שבה נולד אחיו הקטן ואמו טיפלה במקביל בסבתא חולה, התגובות שלה כלפיו היו לא עקביות, לפעמים זמינה מאוד ולפעמים עסוקה ומרוחקת, וכרים למד שאי אפשר לדעת מראש מה הוא יקבל. מתוך החוויה הזאת הוא בנה לעצמו מודל פנימי מלא ספק, ציפייה שהקרבה עלולה להיעלם בכל רגע. בניסוי כזה ילד כמוהו נסער מאוד בהיפרדות, אבל באיחוד קשה להרגיע אותו, והוא מתנדנד בין רצון להיצמד לבין דחייה. גם היום אפשר לראות את זה. הוא זקוק להרבה אישורים חוזרים, מתקשה במעברים, ונצמד לאמא יותר מבני גילו. כשהתחיל בית ספר חדש הוא בכה בכניסה כמה בקרים ברצף. הדפוס הזה משפיע על הקשרים שלו, כי הוא נוטה לחשוש שיינטש, ולכן בודק שוב ושוב שהאהבה עדיין שם.</w:t>
+        <w:t>את כרים מאפיינת התקשרות חרדה-אמביוולנטית. בתקופה שבה נולד אחיו הקטן ואמו טיפלה במקביל בסבתא חולה, התגובות שלה כלפיו היו לא עקביות, לפעמים זמינה מאוד ולפעמים עסוקה ומרוחקת, וכרים למד שאי אפשר לדעת מראש מה הוא יקבל. מתוך החוויה הזאת הוא בנה לעצמו מודל פנימי מלא ספק, ציפייה שהקרבה עלולה להיעלם בכל רגע. בניסוי כזה ילד כמוהו נסער מאוד בהיפרדות, אבל באיחוד קשה להרגיע אותו, והוא מתנדנד בין רצון להיצמד לבין דחייה. גם היום אפשר לראות את זה. הוא זקוק להרבה אישורים חוזרים, מתקשה במעברים, ונצמד לאמא יותר מבני גילו. כשהתחיל בית ספר חדש הוא בכה בכניסה כמה בקרים ברצף. הדפוס הזה משפיע על הקשרים שלו, כי הוא נוטה לחשוש שיינטש, ולכן בודק שוב ושוב שהאהבה עדיין שם. הוא מכליל את החשש הזה גם לקשרים האינטרפרסונליים מחוץ לבית, עם חברים ומורים, ומביא לכל קשר חדש את אותה דריכות שמישהו יעזוב. את זה אפשר לרכך עם יחס יציב ועקבי לאורך זמן, בדיוק ההפך מהחוסר עקביות שיצר את הדפוס מלכתחילה.</w:t>
       </w:r>
     </w:p>
     <w:p>
@@ -529,7 +529,7 @@
           <w:rtl w:val="1"/>
           <w:lang w:val="he-IL" w:bidi="he-IL"/>
         </w:rPr>
-        <w:t>בכרים בולטת האינטליגנציה הגופנית-תנועתית. הגוף שלו הוא כלי החשיבה והביטוי המרכזי, והוא לומד תנועה חדשה במגרש כמעט בהצצה אחת. לצידה ניכרת גם נטייה מוזיקלית חזקה, שמתבטאת בתופים שהוא מנגן בהם בקצב מדויק להפליא. פעם המורה הראה תרגיל כדורגל מסובך פעם אחת, וכרים חזר עליו מיד בצורה מושלמת בזמן שילדים אחרים עוד ניסו להבין מה קרה. הוא עושה את זה מתוך מוטיבציה פנימית, כי התנועה עצמה מהנה לו ולא בשביל פרס. דרך הגוף והתנועה הוא גם מבטא רגשות שקשה לו להוציא במילים, ושם, במגרש ועל התופים, הוא מרגיש הכי מוצלח ובטוח בעצמו. אם המערכת סביבו תזהה את החוזקה הזאת ותבנה עליה, במקום להילחם רק בחוסר השקט, יש סיכוי טוב שהיא תסחוב איתה גם הישגים בתחומים אחרים.</w:t>
+        <w:t>בכרים בולטת האינטליגנציה הגופנית-תנועתית. הגוף שלו הוא כלי החשיבה והביטוי המרכזי, והוא לומד תנועה חדשה במגרש כמעט בהצצה אחת. לצידה ניכרת גם נטייה מוזיקלית חזקה, שמתבטאת בתופים שהוא מנגן בהם בקצב מדויק להפליא. פעם המורה הראה תרגיל כדורגל מסובך פעם אחת, וכרים חזר עליו מיד בצורה מושלמת בזמן שילדים אחרים עוד ניסו להבין מה קרה. הוא עושה את זה מתוך מוטיבציה פנימית, כי התנועה עצמה מהנה לו ולא בשביל פרס. דרך הגוף והתנועה הוא גם מבטא רגשות שקשה לו להוציא במילים, ושם, במגרש ועל התופים, הוא מרגיש הכי מוצלח ובטוח בעצמו. אם המערכת סביבו תזהה את החוזקה הזאת ותבנה עליה, במקום להילחם רק בחוסר השקט, יש סיכוי טוב שהיא תסחוב איתה גם הישגים בתחומים אחרים. והתנועה אצלו מגיעה ממוטיבציה פנימית אמיתית, לא מפרס חיצוני, ולכן מבחן משכל יבש אחד לא היה מצליח לתפוס את מה שכרים באמת יודע לעשות.</w:t>
       </w:r>
     </w:p>
     <w:p>

</xml_diff>